<commit_message>
RAS pour les 3 membres
</commit_message>
<xml_diff>
--- a/Partie 1.docx
+++ b/Partie 1.docx
@@ -644,8 +644,6 @@
               </w:rPr>
               <w:t>Alphanumérique (5</w:t>
             </w:r>
-            <w:bookmarkStart w:id="0" w:name="_GoBack"/>
-            <w:bookmarkEnd w:id="0"/>
             <w:r>
               <w:rPr>
                 <w:sz w:val="24"/>
@@ -3114,241 +3112,10 @@
           </w:p>
         </w:tc>
       </w:tr>
-      <w:tr>
-        <w:trPr>
-          <w:trHeight w:val="744"/>
-          <w:jc w:val="center"/>
-        </w:trPr>
-        <w:tc>
-          <w:tcPr>
-            <w:tcW w:w="2658" w:type="dxa"/>
-            <w:vAlign w:val="center"/>
-          </w:tcPr>
-          <w:p>
-            <w:pPr>
-              <w:jc w:val="center"/>
-              <w:rPr>
-                <w:sz w:val="24"/>
-              </w:rPr>
-            </w:pPr>
-            <w:r>
-              <w:rPr>
-                <w:sz w:val="24"/>
-              </w:rPr>
-              <w:t>nb_jours_travailles</w:t>
-            </w:r>
-          </w:p>
-        </w:tc>
-        <w:tc>
-          <w:tcPr>
-            <w:tcW w:w="2481" w:type="dxa"/>
-            <w:vAlign w:val="center"/>
-          </w:tcPr>
-          <w:p>
-            <w:pPr>
-              <w:jc w:val="center"/>
-              <w:rPr>
-                <w:sz w:val="24"/>
-              </w:rPr>
-            </w:pPr>
-            <w:r>
-              <w:rPr>
-                <w:sz w:val="24"/>
-              </w:rPr>
-              <w:t>Nombre de jours travaillés par l’employé</w:t>
-            </w:r>
-          </w:p>
-        </w:tc>
-        <w:tc>
-          <w:tcPr>
-            <w:tcW w:w="1949" w:type="dxa"/>
-            <w:vAlign w:val="center"/>
-          </w:tcPr>
-          <w:p>
-            <w:pPr>
-              <w:jc w:val="center"/>
-              <w:rPr>
-                <w:sz w:val="24"/>
-              </w:rPr>
-            </w:pPr>
-            <w:r>
-              <w:rPr>
-                <w:sz w:val="24"/>
-              </w:rPr>
-              <w:t>Numérique</w:t>
-            </w:r>
-          </w:p>
-        </w:tc>
-        <w:tc>
-          <w:tcPr>
-            <w:tcW w:w="1280" w:type="dxa"/>
-            <w:vAlign w:val="center"/>
-          </w:tcPr>
-          <w:p>
-            <w:pPr>
-              <w:jc w:val="center"/>
-              <w:rPr>
-                <w:sz w:val="24"/>
-              </w:rPr>
-            </w:pPr>
-            <w:r>
-              <w:rPr>
-                <w:sz w:val="24"/>
-              </w:rPr>
-              <w:t>Sujet 10</w:t>
-            </w:r>
-          </w:p>
-        </w:tc>
-        <w:tc>
-          <w:tcPr>
-            <w:tcW w:w="1743" w:type="dxa"/>
-            <w:vAlign w:val="center"/>
-          </w:tcPr>
-          <w:p>
-            <w:pPr>
-              <w:jc w:val="center"/>
-              <w:rPr>
-                <w:sz w:val="24"/>
-              </w:rPr>
-            </w:pPr>
-          </w:p>
-        </w:tc>
-      </w:tr>
-      <w:tr>
-        <w:trPr>
-          <w:trHeight w:val="744"/>
-          <w:jc w:val="center"/>
-        </w:trPr>
-        <w:tc>
-          <w:tcPr>
-            <w:tcW w:w="2658" w:type="dxa"/>
-            <w:vAlign w:val="center"/>
-          </w:tcPr>
-          <w:p>
-            <w:pPr>
-              <w:jc w:val="center"/>
-              <w:rPr>
-                <w:sz w:val="24"/>
-              </w:rPr>
-            </w:pPr>
-            <w:r>
-              <w:rPr>
-                <w:sz w:val="24"/>
-              </w:rPr>
-              <w:t>nb_absences_injustifiees</w:t>
-            </w:r>
-          </w:p>
-        </w:tc>
-        <w:tc>
-          <w:tcPr>
-            <w:tcW w:w="2481" w:type="dxa"/>
-            <w:vAlign w:val="center"/>
-          </w:tcPr>
-          <w:p>
-            <w:pPr>
-              <w:jc w:val="center"/>
-              <w:rPr>
-                <w:sz w:val="24"/>
-              </w:rPr>
-            </w:pPr>
-            <w:r>
-              <w:rPr>
-                <w:sz w:val="24"/>
-              </w:rPr>
-              <w:t>Nombre d’absences injustifiées de l’employé</w:t>
-            </w:r>
-          </w:p>
-        </w:tc>
-        <w:tc>
-          <w:tcPr>
-            <w:tcW w:w="1949" w:type="dxa"/>
-            <w:vAlign w:val="center"/>
-          </w:tcPr>
-          <w:p>
-            <w:pPr>
-              <w:jc w:val="center"/>
-              <w:rPr>
-                <w:sz w:val="24"/>
-              </w:rPr>
-            </w:pPr>
-            <w:r>
-              <w:rPr>
-                <w:sz w:val="24"/>
-              </w:rPr>
-              <w:t>Numérique</w:t>
-            </w:r>
-          </w:p>
-        </w:tc>
-        <w:tc>
-          <w:tcPr>
-            <w:tcW w:w="1280" w:type="dxa"/>
-            <w:vAlign w:val="center"/>
-          </w:tcPr>
-          <w:p>
-            <w:pPr>
-              <w:jc w:val="center"/>
-              <w:rPr>
-                <w:sz w:val="24"/>
-              </w:rPr>
-            </w:pPr>
-            <w:r>
-              <w:rPr>
-                <w:sz w:val="24"/>
-              </w:rPr>
-              <w:t>Sujet 10</w:t>
-            </w:r>
-          </w:p>
-        </w:tc>
-        <w:tc>
-          <w:tcPr>
-            <w:tcW w:w="1743" w:type="dxa"/>
-            <w:vAlign w:val="center"/>
-          </w:tcPr>
-          <w:p>
-            <w:pPr>
-              <w:jc w:val="center"/>
-              <w:rPr>
-                <w:sz w:val="24"/>
-              </w:rPr>
-            </w:pPr>
-          </w:p>
-        </w:tc>
-      </w:tr>
     </w:tbl>
-    <w:p/>
     <w:p>
-      <w:pPr>
-        <w:pStyle w:val="Paragraphedeliste"/>
-        <w:numPr>
-          <w:ilvl w:val="0"/>
-          <w:numId w:val="3"/>
-        </w:numPr>
-        <w:rPr>
-          <w:b/>
-          <w:sz w:val="28"/>
-        </w:rPr>
-      </w:pPr>
-      <w:r>
-        <w:rPr>
-          <w:b/>
-          <w:sz w:val="28"/>
-        </w:rPr>
-        <w:t>La somme retenue est calculée de même qu</w:t>
-      </w:r>
-      <w:r>
-        <w:rPr>
-          <w:b/>
-          <w:sz w:val="28"/>
-        </w:rPr>
-        <w:t xml:space="preserve">e le salaire net (salaire brut - </w:t>
-      </w:r>
-      <w:r>
-        <w:rPr>
-          <w:b/>
-          <w:sz w:val="28"/>
-        </w:rPr>
-        <w:t>retenues), donc ils ne doivent pas être dans le dictionnaire de données.</w:t>
-      </w:r>
+      <w:bookmarkStart w:id="0" w:name="_GoBack"/>
+      <w:bookmarkEnd w:id="0"/>
     </w:p>
     <w:p>
       <w:pPr>
@@ -3367,29 +3134,21 @@
           <w:b/>
           <w:sz w:val="28"/>
         </w:rPr>
-        <w:lastRenderedPageBreak/>
-        <w:t>chef_dpt</w:t>
+        <w:t>La somme retenue est calculée de même qu</w:t>
       </w:r>
       <w:r>
         <w:rPr>
           <w:b/>
           <w:sz w:val="28"/>
         </w:rPr>
-        <w:t xml:space="preserve">, </w:t>
+        <w:t xml:space="preserve">e le salaire net (salaire brut - </w:t>
       </w:r>
       <w:r>
         <w:rPr>
           <w:b/>
           <w:sz w:val="28"/>
         </w:rPr>
-        <w:t xml:space="preserve">employe_contrat, </w:t>
-      </w:r>
-      <w:r>
-        <w:rPr>
-          <w:b/>
-          <w:sz w:val="28"/>
-        </w:rPr>
-        <w:t>employe_presence, employe_conge et employe_bulletin sont des synonymes de matricule</w:t>
+        <w:t>retenues), donc ils ne doivent pas être dans le dictionnaire de données.</w:t>
       </w:r>
     </w:p>
     <w:p>
@@ -3409,6 +3168,77 @@
           <w:b/>
           <w:sz w:val="28"/>
         </w:rPr>
+        <w:t>Le nombre de jours travaillés et le nombre d’absences injustifiées sont également des données calculées à partir du statut de présence des employés.</w:t>
+      </w:r>
+    </w:p>
+    <w:p>
+      <w:pPr>
+        <w:pStyle w:val="Paragraphedeliste"/>
+        <w:numPr>
+          <w:ilvl w:val="0"/>
+          <w:numId w:val="3"/>
+        </w:numPr>
+        <w:rPr>
+          <w:b/>
+          <w:sz w:val="28"/>
+        </w:rPr>
+      </w:pPr>
+      <w:proofErr w:type="gramStart"/>
+      <w:r>
+        <w:rPr>
+          <w:b/>
+          <w:sz w:val="28"/>
+        </w:rPr>
+        <w:t>chef</w:t>
+      </w:r>
+      <w:proofErr w:type="gramEnd"/>
+      <w:r>
+        <w:rPr>
+          <w:b/>
+          <w:sz w:val="28"/>
+        </w:rPr>
+        <w:t>_dpt</w:t>
+      </w:r>
+      <w:r>
+        <w:rPr>
+          <w:b/>
+          <w:sz w:val="28"/>
+        </w:rPr>
+        <w:t xml:space="preserve">, </w:t>
+      </w:r>
+      <w:r>
+        <w:rPr>
+          <w:b/>
+          <w:sz w:val="28"/>
+        </w:rPr>
+        <w:t xml:space="preserve">employe_contrat, </w:t>
+      </w:r>
+      <w:r>
+        <w:rPr>
+          <w:b/>
+          <w:sz w:val="28"/>
+        </w:rPr>
+        <w:t>employe_presence, employe_conge et employe_bulletin sont des synonymes de matricule</w:t>
+      </w:r>
+    </w:p>
+    <w:p>
+      <w:pPr>
+        <w:pStyle w:val="Paragraphedeliste"/>
+        <w:numPr>
+          <w:ilvl w:val="0"/>
+          <w:numId w:val="3"/>
+        </w:numPr>
+        <w:rPr>
+          <w:b/>
+          <w:sz w:val="28"/>
+        </w:rPr>
+      </w:pPr>
+      <w:r>
+        <w:rPr>
+          <w:b/>
+          <w:sz w:val="28"/>
+        </w:rPr>
+        <w:lastRenderedPageBreak/>
         <w:t>poste synonyme de code_poste</w:t>
       </w:r>
     </w:p>

</xml_diff>